<commit_message>
Address Bugbot review on PR #55
- brand_docx.py: strip_text now recurses into nested tables and header/footer
  tables so disallowed phrases are removed everywhere, matching the docs' claim
  of a full-document strip (was: top-level tables + direct header/footer paras)
- SQOS_OnePager: recolor union-card list text from the pre-rebrand blue tint
  (#EEF2FF) to VBX off-white (#F5F5F0) across HTML, DOCX; PDF re-rendered from
  the corrected HTML (still one A4 page)

Co-Authored-By: Claude Opus 4.8 <noreply@anthropic.com>
Claude-Session: https://claude.ai/code/session_01TCxmNzcRpa8VtR7L1ojUY6
</commit_message>
<xml_diff>
--- a/branded_docs/SQOS_OnePager.docx
+++ b/branded_docs/SQOS_OnePager.docx
@@ -861,7 +861,7 @@
               <w:rPr>
                 <w:b/>
                 <w:bCs/>
-                <w:color w:val="EEF2FF"/>
+                <w:color w:val="F5F5F0"/>
                 <w:sz w:val="15"/>
                 <w:szCs w:val="15"/>
               </w:rPr>
@@ -886,7 +886,7 @@
               <w:rPr>
                 <w:b/>
                 <w:bCs/>
-                <w:color w:val="EEF2FF"/>
+                <w:color w:val="F5F5F0"/>
                 <w:sz w:val="15"/>
                 <w:szCs w:val="15"/>
               </w:rPr>
@@ -911,7 +911,7 @@
               <w:rPr>
                 <w:b/>
                 <w:bCs/>
-                <w:color w:val="EEF2FF"/>
+                <w:color w:val="F5F5F0"/>
                 <w:sz w:val="15"/>
                 <w:szCs w:val="15"/>
               </w:rPr>
@@ -936,7 +936,7 @@
               <w:rPr>
                 <w:b/>
                 <w:bCs/>
-                <w:color w:val="EEF2FF"/>
+                <w:color w:val="F5F5F0"/>
                 <w:sz w:val="15"/>
                 <w:szCs w:val="15"/>
               </w:rPr>
@@ -961,7 +961,7 @@
               <w:rPr>
                 <w:b/>
                 <w:bCs/>
-                <w:color w:val="EEF2FF"/>
+                <w:color w:val="F5F5F0"/>
                 <w:sz w:val="15"/>
                 <w:szCs w:val="15"/>
               </w:rPr>

</xml_diff>